<commit_message>
docs: update documentation, PPT presentation, terms & conditions, and error rectification details
</commit_message>
<xml_diff>
--- a/AI_Voice_Assistant_Project_Report.docx
+++ b/AI_Voice_Assistant_Project_Report.docx
@@ -29,9 +29,9 @@
           <w:rFonts w:ascii="Arial" w:hAnsi="Arial"/>
           <w:i/>
           <w:color w:val="0099CC"/>
-          <w:sz w:val="28"/>
+          <w:sz w:val="26"/>
         </w:rPr>
-        <w:t>Speech Recognition &amp; Synthesis System with Web Control Center &amp; Desktop Automation</w:t>
+        <w:t>Speech Recognition &amp; Synthesis with Google OAuth Sign-In, Email/Password Auth &amp; SQLite Database</w:t>
       </w:r>
     </w:p>
     <w:tbl>
@@ -107,6 +107,32 @@
                 <w:b/>
                 <w:color w:val="003366"/>
               </w:rPr>
+              <w:t>Newest Features:</w:t>
+            </w:r>
+          </w:p>
+        </w:tc>
+        <w:tc>
+          <w:tcPr>
+            <w:tcW w:type="dxa" w:w="4680"/>
+          </w:tcPr>
+          <w:p>
+            <w:r>
+              <w:t>Google OAuth Sign-In, Email/Password Auth, SQLite Relational Database</w:t>
+            </w:r>
+          </w:p>
+        </w:tc>
+      </w:tr>
+      <w:tr>
+        <w:tc>
+          <w:tcPr>
+            <w:tcW w:type="dxa" w:w="4680"/>
+          </w:tcPr>
+          <w:p>
+            <w:r>
+              <w:rPr>
+                <w:b/>
+                <w:color w:val="003366"/>
+              </w:rPr>
               <w:t>Technologies Used:</w:t>
             </w:r>
           </w:p>
@@ -117,7 +143,7 @@
           </w:tcPr>
           <w:p>
             <w:r>
-              <w:t>Python 3.13, SpeechRecognition, pyttsx3, Flask, PyAudio, Wikipedia API, HTML5/CSS3/JS</w:t>
+              <w:t>Python 3.13, SQLite 3, Flask, Google GIS SDK, SpeechRecognition, pyttsx3, PyAudio</w:t>
             </w:r>
           </w:p>
         </w:tc>
@@ -143,7 +169,7 @@
           </w:tcPr>
           <w:p>
             <w:r>
-              <w:t>100% Passed (10/10 Automated Tests Passed)</w:t>
+              <w:t>100% Passed (14/14 Automated Tests Passed)</w:t>
             </w:r>
           </w:p>
         </w:tc>
@@ -162,12 +188,12 @@
         <w:rPr>
           <w:color w:val="003366"/>
         </w:rPr>
-        <w:t>1. Executive Summary &amp; Problem Statement</w:t>
+        <w:t>1. Executive Summary &amp; Project Objectives</w:t>
       </w:r>
     </w:p>
     <w:p>
       <w:r>
-        <w:t>Voice assistants have become an integral part of modern computing, enabling hands-free system interaction, improving convenience, and enhancing digital accessibility. This project focuses on designing and implementing a fully functional, AI-powered Voice Assistant (ARIA) capable of converting spoken voice commands into text, processing intent, performing automated system/web actions, and delivering audible spoken responses.</w:t>
+        <w:t>Voice assistants have become an essential technology in modern computing, enabling hands-free system interaction, improving digital accessibility, and boosting user productivity. This project presents ARIA (AI-Based Voice Assistant), a complete intelligent assistant featuring real-time speech recognition, text-to-speech synthesis, system automation, Google OAuth Sign-In integration, Email &amp; Password authentication, and a persistent SQLite SQL Database for user accounts and chat history.</w:t>
       </w:r>
     </w:p>
     <w:p>
@@ -178,7 +204,7 @@
         <w:rPr>
           <w:color w:val="0099CC"/>
         </w:rPr>
-        <w:t>1.1 Objectives</w:t>
+        <w:t>1.1 Key Objectives</w:t>
       </w:r>
     </w:p>
     <w:p>
@@ -186,7 +212,7 @@
         <w:pStyle w:val="ListBullet"/>
       </w:pPr>
       <w:r>
-        <w:t>Audio Capture &amp; Transcription: Capture real-time microphone input and convert speech to text using SpeechRecognition.</w:t>
+        <w:t>Google Sign-In System Integration: Connect ARIA to Google's official Identity Services (GIS SDK) for seamless OAuth 2.0 single sign-on.</w:t>
       </w:r>
     </w:p>
     <w:p>
@@ -194,7 +220,31 @@
         <w:pStyle w:val="ListBullet"/>
       </w:pPr>
       <w:r>
-        <w:t>Voice Response Synthesis: Convert system text responses into clear audible speech using offline pyttsx3 Text-to-Speech (TTS).</w:t>
+        <w:t>Email &amp; Password Authentication: Provide full account registration and login backed by secure Werkzeug password hashing.</w:t>
+      </w:r>
+    </w:p>
+    <w:p>
+      <w:pPr>
+        <w:pStyle w:val="ListBullet"/>
+      </w:pPr>
+      <w:r>
+        <w:t>Persistent Relational SQL Database: Store user profiles and chat history in a persistent SQLite database (database.db) with structured relational tables (users, chat_history).</w:t>
+      </w:r>
+    </w:p>
+    <w:p>
+      <w:pPr>
+        <w:pStyle w:val="ListBullet"/>
+      </w:pPr>
+      <w:r>
+        <w:t>Audio Capture &amp; Transcription: Capture real-time microphone input and convert speech to text using SpeechRecognition and PyAudio.</w:t>
+      </w:r>
+    </w:p>
+    <w:p>
+      <w:pPr>
+        <w:pStyle w:val="ListBullet"/>
+      </w:pPr>
+      <w:r>
+        <w:t>Voice Response Synthesis: Convert system responses into clear audible speech using offline pyttsx3 Text-to-Speech (TTS).</w:t>
       </w:r>
     </w:p>
     <w:p>
@@ -210,14 +260,6 @@
         <w:pStyle w:val="ListBullet"/>
       </w:pPr>
       <w:r>
-        <w:t>Web &amp; API Information Retrieval: Instant Wikipedia search and multi-source Google Search Reports with title/snippet extraction.</w:t>
-      </w:r>
-    </w:p>
-    <w:p>
-      <w:pPr>
-        <w:pStyle w:val="ListBullet"/>
-      </w:pPr>
-      <w:r>
         <w:t>System &amp; Web Automation: Open local applications (Notepad, Calculator, CMD, Explorer, Paint) and web portals (YouTube, Google, StackOverflow).</w:t>
       </w:r>
     </w:p>
@@ -226,7 +268,7 @@
         <w:pStyle w:val="ListBullet"/>
       </w:pPr>
       <w:r>
-        <w:t>Interactive Glassmorphism GUI: Provide a futuristic web control center featuring real-time CPU/RAM gauges, canvas audio visualizer, sound effects, and built-in interactive Notepad/Calculator modals.</w:t>
+        <w:t>Interactive Glassmorphism GUI: Provide a futuristic web control center featuring real-time gauges, visualizer, sound effects, and built-in interactive modals.</w:t>
       </w:r>
     </w:p>
     <w:p>
@@ -237,12 +279,12 @@
         <w:rPr>
           <w:color w:val="003366"/>
         </w:rPr>
-        <w:t>2. System Architecture &amp; Component Design</w:t>
+        <w:t>2. System Architecture &amp; SQL Database Schema</w:t>
       </w:r>
     </w:p>
     <w:p>
       <w:r>
-        <w:t>The project adopts a modular architecture separating core voice engine processing from the user interaction layer. The system consists of three main operational tiers:</w:t>
+        <w:t>The application follows a 3-tier operational model separating front-end presentation, server logic, and database persistence:</w:t>
       </w:r>
     </w:p>
     <w:p>
@@ -250,7 +292,7 @@
         <w:pStyle w:val="ListBullet"/>
       </w:pPr>
       <w:r>
-        <w:t>Core Voice Engine (voice_assistant.py): Handles PyAudio mic capture, SpeechRecognition STT, pyttsx3 TTS synthesis, intent routing, and search APIs.</w:t>
+        <w:t>Frontend Tier (templates/login.html &amp; index.html): Glassmorphic web interface with Google GIS SDK, Auth mode switcher, Web Audio API sound effects, and canvas waveform visualizer.</w:t>
       </w:r>
     </w:p>
     <w:p>
@@ -258,7 +300,7 @@
         <w:pStyle w:val="ListBullet"/>
       </w:pPr>
       <w:r>
-        <w:t>Web API &amp; Server Layer (app.py): Flask REST API exposing endpoints /api/command, /api/status, and /api/listen for HTTP communication.</w:t>
+        <w:t>Server Tier (app.py): Flask REST API server processing commands, handling Google OAuth verification (/api/auth/google), Email login (/api/auth/email-login), and Registration (/api/auth/register).</w:t>
       </w:r>
     </w:p>
     <w:p>
@@ -266,7 +308,7 @@
         <w:pStyle w:val="ListBullet"/>
       </w:pPr>
       <w:r>
-        <w:t>Web Control Center Frontend (index.html &amp; app.js): Futuristic UI with Web Audio API sound effects, audio spectrum canvas visualizer, CPU/RAM monitoring, and interactive Glassmorphism modals.</w:t>
+        <w:t>Database Tier (database.db): SQLite relational database storing user profile credentials and session chat history.</w:t>
       </w:r>
     </w:p>
     <w:p>
@@ -277,7 +319,15 @@
         <w:rPr>
           <w:color w:val="0099CC"/>
         </w:rPr>
-        <w:t>2.1 Data Processing Flow</w:t>
+        <w:t>2.1 SQL Database Tables Schema</w:t>
+      </w:r>
+    </w:p>
+    <w:p>
+      <w:pPr>
+        <w:pStyle w:val="Heading3"/>
+      </w:pPr>
+      <w:r>
+        <w:t>Table 1: users (User Accounts &amp; Authentication)</w:t>
       </w:r>
     </w:p>
     <w:tbl>
@@ -287,14 +337,15 @@
         <w:tblLook w:firstColumn="1" w:firstRow="1" w:lastColumn="0" w:lastRow="0" w:noHBand="0" w:noVBand="1" w:val="04A0"/>
       </w:tblPr>
       <w:tblGrid>
-        <w:gridCol w:w="3120"/>
-        <w:gridCol w:w="3120"/>
-        <w:gridCol w:w="3120"/>
+        <w:gridCol w:w="2340"/>
+        <w:gridCol w:w="2340"/>
+        <w:gridCol w:w="2340"/>
+        <w:gridCol w:w="2340"/>
       </w:tblGrid>
       <w:tr>
         <w:tc>
           <w:tcPr>
-            <w:tcW w:type="dxa" w:w="3120"/>
+            <w:tcW w:type="dxa" w:w="2340"/>
             <w:shd w:fill="003366"/>
           </w:tcPr>
           <w:p>
@@ -303,13 +354,13 @@
                 <w:b/>
                 <w:color w:val="FFFFFF"/>
               </w:rPr>
-              <w:t>Step</w:t>
+              <w:t>Column Name</w:t>
             </w:r>
           </w:p>
         </w:tc>
         <w:tc>
           <w:tcPr>
-            <w:tcW w:type="dxa" w:w="3120"/>
+            <w:tcW w:type="dxa" w:w="2340"/>
             <w:shd w:fill="003366"/>
           </w:tcPr>
           <w:p>
@@ -318,13 +369,13 @@
                 <w:b/>
                 <w:color w:val="FFFFFF"/>
               </w:rPr>
-              <w:t>Module</w:t>
+              <w:t>Data Type</w:t>
             </w:r>
           </w:p>
         </w:tc>
         <w:tc>
           <w:tcPr>
-            <w:tcW w:type="dxa" w:w="3120"/>
+            <w:tcW w:type="dxa" w:w="2340"/>
             <w:shd w:fill="003366"/>
           </w:tcPr>
           <w:p>
@@ -333,7 +384,22 @@
                 <w:b/>
                 <w:color w:val="FFFFFF"/>
               </w:rPr>
-              <w:t>Action Performed</w:t>
+              <w:t>Constraint</w:t>
+            </w:r>
+          </w:p>
+        </w:tc>
+        <w:tc>
+          <w:tcPr>
+            <w:tcW w:type="dxa" w:w="2340"/>
+            <w:shd w:fill="003366"/>
+          </w:tcPr>
+          <w:p>
+            <w:r>
+              <w:rPr>
+                <w:b/>
+                <w:color w:val="FFFFFF"/>
+              </w:rPr>
+              <w:t>Description</w:t>
             </w:r>
           </w:p>
         </w:tc>
@@ -341,31 +407,41 @@
       <w:tr>
         <w:tc>
           <w:tcPr>
-            <w:tcW w:type="dxa" w:w="3120"/>
+            <w:tcW w:type="dxa" w:w="2340"/>
           </w:tcPr>
           <w:p>
             <w:r>
-              <w:t>1. Audio Capture</w:t>
+              <w:t>id</w:t>
             </w:r>
           </w:p>
         </w:tc>
         <w:tc>
           <w:tcPr>
-            <w:tcW w:type="dxa" w:w="3120"/>
+            <w:tcW w:type="dxa" w:w="2340"/>
           </w:tcPr>
           <w:p>
             <w:r>
-              <w:t>PyAudio &amp; Web Audio API</w:t>
+              <w:t>TEXT</w:t>
             </w:r>
           </w:p>
         </w:tc>
         <w:tc>
           <w:tcPr>
-            <w:tcW w:type="dxa" w:w="3120"/>
+            <w:tcW w:type="dxa" w:w="2340"/>
           </w:tcPr>
           <w:p>
             <w:r>
-              <w:t>Captures microphone audio stream from user host or browser.</w:t>
+              <w:t>PRIMARY KEY</w:t>
+            </w:r>
+          </w:p>
+        </w:tc>
+        <w:tc>
+          <w:tcPr>
+            <w:tcW w:type="dxa" w:w="2340"/>
+          </w:tcPr>
+          <w:p>
+            <w:r>
+              <w:t>Unique User ID (e.g. google_123456... or usr_a8f92b...)</w:t>
             </w:r>
           </w:p>
         </w:tc>
@@ -373,31 +449,41 @@
       <w:tr>
         <w:tc>
           <w:tcPr>
-            <w:tcW w:type="dxa" w:w="3120"/>
+            <w:tcW w:type="dxa" w:w="2340"/>
           </w:tcPr>
           <w:p>
             <w:r>
-              <w:t>2. Speech-to-Text</w:t>
+              <w:t>name</w:t>
             </w:r>
           </w:p>
         </w:tc>
         <w:tc>
           <w:tcPr>
-            <w:tcW w:type="dxa" w:w="3120"/>
+            <w:tcW w:type="dxa" w:w="2340"/>
           </w:tcPr>
           <w:p>
             <w:r>
-              <w:t>SpeechRecognition (Google STT)</w:t>
+              <w:t>TEXT</w:t>
             </w:r>
           </w:p>
         </w:tc>
         <w:tc>
           <w:tcPr>
-            <w:tcW w:type="dxa" w:w="3120"/>
+            <w:tcW w:type="dxa" w:w="2340"/>
           </w:tcPr>
           <w:p>
             <w:r>
-              <w:t>Converts audio waveform into clean text transcript string.</w:t>
+              <w:t>NOT NULL</w:t>
+            </w:r>
+          </w:p>
+        </w:tc>
+        <w:tc>
+          <w:tcPr>
+            <w:tcW w:type="dxa" w:w="2340"/>
+          </w:tcPr>
+          <w:p>
+            <w:r>
+              <w:t>User's full display name</w:t>
             </w:r>
           </w:p>
         </w:tc>
@@ -405,31 +491,41 @@
       <w:tr>
         <w:tc>
           <w:tcPr>
-            <w:tcW w:type="dxa" w:w="3120"/>
+            <w:tcW w:type="dxa" w:w="2340"/>
           </w:tcPr>
           <w:p>
             <w:r>
-              <w:t>3. Intent Router</w:t>
+              <w:t>email</w:t>
             </w:r>
           </w:p>
         </w:tc>
         <w:tc>
           <w:tcPr>
-            <w:tcW w:type="dxa" w:w="3120"/>
+            <w:tcW w:type="dxa" w:w="2340"/>
           </w:tcPr>
           <w:p>
             <w:r>
-              <w:t>VoiceAssistant.process_command()</w:t>
+              <w:t>TEXT</w:t>
             </w:r>
           </w:p>
         </w:tc>
         <w:tc>
           <w:tcPr>
-            <w:tcW w:type="dxa" w:w="3120"/>
+            <w:tcW w:type="dxa" w:w="2340"/>
           </w:tcPr>
           <w:p>
             <w:r>
-              <w:t>Matches command against patterns (Time, Math, Apps, Web Search).</w:t>
+              <w:t>UNIQUE NOT NULL</w:t>
+            </w:r>
+          </w:p>
+        </w:tc>
+        <w:tc>
+          <w:tcPr>
+            <w:tcW w:type="dxa" w:w="2340"/>
+          </w:tcPr>
+          <w:p>
+            <w:r>
+              <w:t>User's registered email address</w:t>
             </w:r>
           </w:p>
         </w:tc>
@@ -437,31 +533,41 @@
       <w:tr>
         <w:tc>
           <w:tcPr>
-            <w:tcW w:type="dxa" w:w="3120"/>
+            <w:tcW w:type="dxa" w:w="2340"/>
           </w:tcPr>
           <w:p>
             <w:r>
-              <w:t>4. Execution &amp; Retrieval</w:t>
+              <w:t>password_hash</w:t>
             </w:r>
           </w:p>
         </w:tc>
         <w:tc>
           <w:tcPr>
-            <w:tcW w:type="dxa" w:w="3120"/>
+            <w:tcW w:type="dxa" w:w="2340"/>
           </w:tcPr>
           <w:p>
             <w:r>
-              <w:t>OS Automation &amp; Search APIs</w:t>
+              <w:t>TEXT</w:t>
             </w:r>
           </w:p>
         </w:tc>
         <w:tc>
           <w:tcPr>
-            <w:tcW w:type="dxa" w:w="3120"/>
+            <w:tcW w:type="dxa" w:w="2340"/>
           </w:tcPr>
           <w:p>
             <w:r>
-              <w:t>Launches app, executes math, or fetches Wikipedia/Google Search Reports.</w:t>
+              <w:t>NULLABLE</w:t>
+            </w:r>
+          </w:p>
+        </w:tc>
+        <w:tc>
+          <w:tcPr>
+            <w:tcW w:type="dxa" w:w="2340"/>
+          </w:tcPr>
+          <w:p>
+            <w:r>
+              <w:t>Werkzeug salted password hash (NULL for Google users)</w:t>
             </w:r>
           </w:p>
         </w:tc>
@@ -469,31 +575,545 @@
       <w:tr>
         <w:tc>
           <w:tcPr>
-            <w:tcW w:type="dxa" w:w="3120"/>
+            <w:tcW w:type="dxa" w:w="2340"/>
           </w:tcPr>
           <w:p>
             <w:r>
-              <w:t>5. Text-to-Speech</w:t>
+              <w:t>provider</w:t>
             </w:r>
           </w:p>
         </w:tc>
         <w:tc>
           <w:tcPr>
-            <w:tcW w:type="dxa" w:w="3120"/>
+            <w:tcW w:type="dxa" w:w="2340"/>
           </w:tcPr>
           <w:p>
             <w:r>
-              <w:t>pyttsx3 &amp; Web SpeechSynthesis</w:t>
+              <w:t>TEXT</w:t>
             </w:r>
           </w:p>
         </w:tc>
         <w:tc>
           <w:tcPr>
-            <w:tcW w:type="dxa" w:w="3120"/>
+            <w:tcW w:type="dxa" w:w="2340"/>
           </w:tcPr>
           <w:p>
             <w:r>
-              <w:t>Synthesizes audible spoken response through host speakers and browser.</w:t>
+              <w:t>NOT NULL</w:t>
+            </w:r>
+          </w:p>
+        </w:tc>
+        <w:tc>
+          <w:tcPr>
+            <w:tcW w:type="dxa" w:w="2340"/>
+          </w:tcPr>
+          <w:p>
+            <w:r>
+              <w:t>Auth provider used ('Google' or 'Email')</w:t>
+            </w:r>
+          </w:p>
+        </w:tc>
+      </w:tr>
+      <w:tr>
+        <w:tc>
+          <w:tcPr>
+            <w:tcW w:type="dxa" w:w="2340"/>
+          </w:tcPr>
+          <w:p>
+            <w:r>
+              <w:t>picture</w:t>
+            </w:r>
+          </w:p>
+        </w:tc>
+        <w:tc>
+          <w:tcPr>
+            <w:tcW w:type="dxa" w:w="2340"/>
+          </w:tcPr>
+          <w:p>
+            <w:r>
+              <w:t>TEXT</w:t>
+            </w:r>
+          </w:p>
+        </w:tc>
+        <w:tc>
+          <w:tcPr>
+            <w:tcW w:type="dxa" w:w="2340"/>
+          </w:tcPr>
+          <w:p>
+            <w:r>
+              <w:t>NULLABLE</w:t>
+            </w:r>
+          </w:p>
+        </w:tc>
+        <w:tc>
+          <w:tcPr>
+            <w:tcW w:type="dxa" w:w="2340"/>
+          </w:tcPr>
+          <w:p>
+            <w:r>
+              <w:t>Profile avatar URL from Google OAuth</w:t>
+            </w:r>
+          </w:p>
+        </w:tc>
+      </w:tr>
+      <w:tr>
+        <w:tc>
+          <w:tcPr>
+            <w:tcW w:type="dxa" w:w="2340"/>
+          </w:tcPr>
+          <w:p>
+            <w:r>
+              <w:t>created_at</w:t>
+            </w:r>
+          </w:p>
+        </w:tc>
+        <w:tc>
+          <w:tcPr>
+            <w:tcW w:type="dxa" w:w="2340"/>
+          </w:tcPr>
+          <w:p>
+            <w:r>
+              <w:t>TIMESTAMP</w:t>
+            </w:r>
+          </w:p>
+        </w:tc>
+        <w:tc>
+          <w:tcPr>
+            <w:tcW w:type="dxa" w:w="2340"/>
+          </w:tcPr>
+          <w:p>
+            <w:r>
+              <w:t>DEFAULT CURRENT_TIMESTAMP</w:t>
+            </w:r>
+          </w:p>
+        </w:tc>
+        <w:tc>
+          <w:tcPr>
+            <w:tcW w:type="dxa" w:w="2340"/>
+          </w:tcPr>
+          <w:p>
+            <w:r>
+              <w:t>Account registration timestamp</w:t>
+            </w:r>
+          </w:p>
+        </w:tc>
+      </w:tr>
+      <w:tr>
+        <w:tc>
+          <w:tcPr>
+            <w:tcW w:type="dxa" w:w="2340"/>
+          </w:tcPr>
+          <w:p>
+            <w:r>
+              <w:t>last_login</w:t>
+            </w:r>
+          </w:p>
+        </w:tc>
+        <w:tc>
+          <w:tcPr>
+            <w:tcW w:type="dxa" w:w="2340"/>
+          </w:tcPr>
+          <w:p>
+            <w:r>
+              <w:t>TIMESTAMP</w:t>
+            </w:r>
+          </w:p>
+        </w:tc>
+        <w:tc>
+          <w:tcPr>
+            <w:tcW w:type="dxa" w:w="2340"/>
+          </w:tcPr>
+          <w:p>
+            <w:r>
+              <w:t>DEFAULT CURRENT_TIMESTAMP</w:t>
+            </w:r>
+          </w:p>
+        </w:tc>
+        <w:tc>
+          <w:tcPr>
+            <w:tcW w:type="dxa" w:w="2340"/>
+          </w:tcPr>
+          <w:p>
+            <w:r>
+              <w:t>Latest login session timestamp</w:t>
+            </w:r>
+          </w:p>
+        </w:tc>
+      </w:tr>
+    </w:tbl>
+    <w:p/>
+    <w:p>
+      <w:pPr>
+        <w:pStyle w:val="Heading3"/>
+      </w:pPr>
+      <w:r>
+        <w:t>Table 2: chat_history (Conversation History Logs)</w:t>
+      </w:r>
+    </w:p>
+    <w:tbl>
+      <w:tblPr>
+        <w:tblW w:type="auto" w:w="0"/>
+        <w:jc w:val="center"/>
+        <w:tblLook w:firstColumn="1" w:firstRow="1" w:lastColumn="0" w:lastRow="0" w:noHBand="0" w:noVBand="1" w:val="04A0"/>
+      </w:tblPr>
+      <w:tblGrid>
+        <w:gridCol w:w="2340"/>
+        <w:gridCol w:w="2340"/>
+        <w:gridCol w:w="2340"/>
+        <w:gridCol w:w="2340"/>
+      </w:tblGrid>
+      <w:tr>
+        <w:tc>
+          <w:tcPr>
+            <w:tcW w:type="dxa" w:w="2340"/>
+            <w:shd w:fill="003366"/>
+          </w:tcPr>
+          <w:p>
+            <w:r>
+              <w:rPr>
+                <w:b/>
+                <w:color w:val="FFFFFF"/>
+              </w:rPr>
+              <w:t>Column Name</w:t>
+            </w:r>
+          </w:p>
+        </w:tc>
+        <w:tc>
+          <w:tcPr>
+            <w:tcW w:type="dxa" w:w="2340"/>
+            <w:shd w:fill="003366"/>
+          </w:tcPr>
+          <w:p>
+            <w:r>
+              <w:rPr>
+                <w:b/>
+                <w:color w:val="FFFFFF"/>
+              </w:rPr>
+              <w:t>Data Type</w:t>
+            </w:r>
+          </w:p>
+        </w:tc>
+        <w:tc>
+          <w:tcPr>
+            <w:tcW w:type="dxa" w:w="2340"/>
+            <w:shd w:fill="003366"/>
+          </w:tcPr>
+          <w:p>
+            <w:r>
+              <w:rPr>
+                <w:b/>
+                <w:color w:val="FFFFFF"/>
+              </w:rPr>
+              <w:t>Constraint</w:t>
+            </w:r>
+          </w:p>
+        </w:tc>
+        <w:tc>
+          <w:tcPr>
+            <w:tcW w:type="dxa" w:w="2340"/>
+            <w:shd w:fill="003366"/>
+          </w:tcPr>
+          <w:p>
+            <w:r>
+              <w:rPr>
+                <w:b/>
+                <w:color w:val="FFFFFF"/>
+              </w:rPr>
+              <w:t>Description</w:t>
+            </w:r>
+          </w:p>
+        </w:tc>
+      </w:tr>
+      <w:tr>
+        <w:tc>
+          <w:tcPr>
+            <w:tcW w:type="dxa" w:w="2340"/>
+          </w:tcPr>
+          <w:p>
+            <w:r>
+              <w:t>id</w:t>
+            </w:r>
+          </w:p>
+        </w:tc>
+        <w:tc>
+          <w:tcPr>
+            <w:tcW w:type="dxa" w:w="2340"/>
+          </w:tcPr>
+          <w:p>
+            <w:r>
+              <w:t>INTEGER</w:t>
+            </w:r>
+          </w:p>
+        </w:tc>
+        <w:tc>
+          <w:tcPr>
+            <w:tcW w:type="dxa" w:w="2340"/>
+          </w:tcPr>
+          <w:p>
+            <w:r>
+              <w:t>PRIMARY KEY AUTOINCREMENT</w:t>
+            </w:r>
+          </w:p>
+        </w:tc>
+        <w:tc>
+          <w:tcPr>
+            <w:tcW w:type="dxa" w:w="2340"/>
+          </w:tcPr>
+          <w:p>
+            <w:r>
+              <w:t>Unique chat message ID</w:t>
+            </w:r>
+          </w:p>
+        </w:tc>
+      </w:tr>
+      <w:tr>
+        <w:tc>
+          <w:tcPr>
+            <w:tcW w:type="dxa" w:w="2340"/>
+          </w:tcPr>
+          <w:p>
+            <w:r>
+              <w:t>user_id</w:t>
+            </w:r>
+          </w:p>
+        </w:tc>
+        <w:tc>
+          <w:tcPr>
+            <w:tcW w:type="dxa" w:w="2340"/>
+          </w:tcPr>
+          <w:p>
+            <w:r>
+              <w:t>TEXT</w:t>
+            </w:r>
+          </w:p>
+        </w:tc>
+        <w:tc>
+          <w:tcPr>
+            <w:tcW w:type="dxa" w:w="2340"/>
+          </w:tcPr>
+          <w:p>
+            <w:r>
+              <w:t>NOT NULL</w:t>
+            </w:r>
+          </w:p>
+        </w:tc>
+        <w:tc>
+          <w:tcPr>
+            <w:tcW w:type="dxa" w:w="2340"/>
+          </w:tcPr>
+          <w:p>
+            <w:r>
+              <w:t>Links message to user account in users table</w:t>
+            </w:r>
+          </w:p>
+        </w:tc>
+      </w:tr>
+      <w:tr>
+        <w:tc>
+          <w:tcPr>
+            <w:tcW w:type="dxa" w:w="2340"/>
+          </w:tcPr>
+          <w:p>
+            <w:r>
+              <w:t>session_id</w:t>
+            </w:r>
+          </w:p>
+        </w:tc>
+        <w:tc>
+          <w:tcPr>
+            <w:tcW w:type="dxa" w:w="2340"/>
+          </w:tcPr>
+          <w:p>
+            <w:r>
+              <w:t>TEXT</w:t>
+            </w:r>
+          </w:p>
+        </w:tc>
+        <w:tc>
+          <w:tcPr>
+            <w:tcW w:type="dxa" w:w="2340"/>
+          </w:tcPr>
+          <w:p>
+            <w:r>
+              <w:t>NOT NULL</w:t>
+            </w:r>
+          </w:p>
+        </w:tc>
+        <w:tc>
+          <w:tcPr>
+            <w:tcW w:type="dxa" w:w="2340"/>
+          </w:tcPr>
+          <w:p>
+            <w:r>
+              <w:t>Group identifier for conversation session</w:t>
+            </w:r>
+          </w:p>
+        </w:tc>
+      </w:tr>
+      <w:tr>
+        <w:tc>
+          <w:tcPr>
+            <w:tcW w:type="dxa" w:w="2340"/>
+          </w:tcPr>
+          <w:p>
+            <w:r>
+              <w:t>role</w:t>
+            </w:r>
+          </w:p>
+        </w:tc>
+        <w:tc>
+          <w:tcPr>
+            <w:tcW w:type="dxa" w:w="2340"/>
+          </w:tcPr>
+          <w:p>
+            <w:r>
+              <w:t>TEXT</w:t>
+            </w:r>
+          </w:p>
+        </w:tc>
+        <w:tc>
+          <w:tcPr>
+            <w:tcW w:type="dxa" w:w="2340"/>
+          </w:tcPr>
+          <w:p>
+            <w:r>
+              <w:t>NOT NULL</w:t>
+            </w:r>
+          </w:p>
+        </w:tc>
+        <w:tc>
+          <w:tcPr>
+            <w:tcW w:type="dxa" w:w="2340"/>
+          </w:tcPr>
+          <w:p>
+            <w:r>
+              <w:t>Sender role ('user' or 'assistant')</w:t>
+            </w:r>
+          </w:p>
+        </w:tc>
+      </w:tr>
+      <w:tr>
+        <w:tc>
+          <w:tcPr>
+            <w:tcW w:type="dxa" w:w="2340"/>
+          </w:tcPr>
+          <w:p>
+            <w:r>
+              <w:t>message</w:t>
+            </w:r>
+          </w:p>
+        </w:tc>
+        <w:tc>
+          <w:tcPr>
+            <w:tcW w:type="dxa" w:w="2340"/>
+          </w:tcPr>
+          <w:p>
+            <w:r>
+              <w:t>TEXT</w:t>
+            </w:r>
+          </w:p>
+        </w:tc>
+        <w:tc>
+          <w:tcPr>
+            <w:tcW w:type="dxa" w:w="2340"/>
+          </w:tcPr>
+          <w:p>
+            <w:r>
+              <w:t>NOT NULL</w:t>
+            </w:r>
+          </w:p>
+        </w:tc>
+        <w:tc>
+          <w:tcPr>
+            <w:tcW w:type="dxa" w:w="2340"/>
+          </w:tcPr>
+          <w:p>
+            <w:r>
+              <w:t>Full transcript text of the message</w:t>
+            </w:r>
+          </w:p>
+        </w:tc>
+      </w:tr>
+      <w:tr>
+        <w:tc>
+          <w:tcPr>
+            <w:tcW w:type="dxa" w:w="2340"/>
+          </w:tcPr>
+          <w:p>
+            <w:r>
+              <w:t>category</w:t>
+            </w:r>
+          </w:p>
+        </w:tc>
+        <w:tc>
+          <w:tcPr>
+            <w:tcW w:type="dxa" w:w="2340"/>
+          </w:tcPr>
+          <w:p>
+            <w:r>
+              <w:t>TEXT</w:t>
+            </w:r>
+          </w:p>
+        </w:tc>
+        <w:tc>
+          <w:tcPr>
+            <w:tcW w:type="dxa" w:w="2340"/>
+          </w:tcPr>
+          <w:p>
+            <w:r>
+              <w:t>NULLABLE</w:t>
+            </w:r>
+          </w:p>
+        </w:tc>
+        <w:tc>
+          <w:tcPr>
+            <w:tcW w:type="dxa" w:w="2340"/>
+          </w:tcPr>
+          <w:p>
+            <w:r>
+              <w:t>Command category (time, math, weather, general)</w:t>
+            </w:r>
+          </w:p>
+        </w:tc>
+      </w:tr>
+      <w:tr>
+        <w:tc>
+          <w:tcPr>
+            <w:tcW w:type="dxa" w:w="2340"/>
+          </w:tcPr>
+          <w:p>
+            <w:r>
+              <w:t>timestamp</w:t>
+            </w:r>
+          </w:p>
+        </w:tc>
+        <w:tc>
+          <w:tcPr>
+            <w:tcW w:type="dxa" w:w="2340"/>
+          </w:tcPr>
+          <w:p>
+            <w:r>
+              <w:t>TIMESTAMP</w:t>
+            </w:r>
+          </w:p>
+        </w:tc>
+        <w:tc>
+          <w:tcPr>
+            <w:tcW w:type="dxa" w:w="2340"/>
+          </w:tcPr>
+          <w:p>
+            <w:r>
+              <w:t>DEFAULT CURRENT_TIMESTAMP</w:t>
+            </w:r>
+          </w:p>
+        </w:tc>
+        <w:tc>
+          <w:tcPr>
+            <w:tcW w:type="dxa" w:w="2340"/>
+          </w:tcPr>
+          <w:p>
+            <w:r>
+              <w:t>Timestamp of message recording</w:t>
             </w:r>
           </w:p>
         </w:tc>
@@ -512,7 +1132,18 @@
         <w:rPr>
           <w:color w:val="003366"/>
         </w:rPr>
-        <w:t>3. Key Features &amp; Implementation Details</w:t>
+        <w:t>3. Terms &amp; Conditions and Error Rectification</w:t>
+      </w:r>
+    </w:p>
+    <w:p>
+      <w:pPr>
+        <w:pStyle w:val="Heading2"/>
+      </w:pPr>
+      <w:r>
+        <w:rPr>
+          <w:color w:val="0099CC"/>
+        </w:rPr>
+        <w:t>3.1 Terms &amp; Conditions (Operational &amp; Legal Guidelines)</w:t>
       </w:r>
     </w:p>
     <w:p>
@@ -521,10 +1152,10 @@
           <w:b/>
           <w:color w:val="003366"/>
         </w:rPr>
-        <w:t xml:space="preserve">• Time &amp; Date Telling: </w:t>
+        <w:t xml:space="preserve">• User Privacy &amp; Data Protection: </w:t>
       </w:r>
       <w:r>
-        <w:t>Returns current system time and date formatted nicely in 12-hour AM/PM format.</w:t>
+        <w:t>User passwords are never stored in plain text. They are protected using Werkzeug cryptographic password hashing (PBKDF2 with SHA-256 salting). Google OAuth profile data is used strictly for authentication and user account creation.</w:t>
       </w:r>
     </w:p>
     <w:p>
@@ -533,10 +1164,10 @@
           <w:b/>
           <w:color w:val="003366"/>
         </w:rPr>
-        <w:t xml:space="preserve">• Desktop Application Launcher: </w:t>
+        <w:t xml:space="preserve">• Microphone Audio Streams: </w:t>
       </w:r>
       <w:r>
-        <w:t>Launches local applications (Notepad, Calculator, CMD, Explorer, MS Paint) via os.startfile and subprocess.Popen.</w:t>
+        <w:t>Spoken voice audio captured via the microphone is converted to text locally or via browser Web Speech API solely for intent processing. Audio streams are not retained on remote servers without explicit user command.</w:t>
       </w:r>
     </w:p>
     <w:p>
@@ -545,10 +1176,10 @@
           <w:b/>
           <w:color w:val="003366"/>
         </w:rPr>
-        <w:t xml:space="preserve">• Interactive Glassmorphism Modals: </w:t>
+        <w:t xml:space="preserve">• Account Confidentiality: </w:t>
       </w:r>
       <w:r>
-        <w:t>Includes built-in on-screen Notepad (with .txt file saving &amp; word counts) and Calculator (with interactive grid keypad).</w:t>
+        <w:t>Users are responsible for safeguarding their login credentials. Chat histories are linked to individual user IDs in the SQLite database to guarantee session privacy.</w:t>
       </w:r>
     </w:p>
     <w:p>
@@ -557,10 +1188,21 @@
           <w:b/>
           <w:color w:val="003366"/>
         </w:rPr>
-        <w:t xml:space="preserve">• Google &amp; Web Search Reports: </w:t>
+        <w:t xml:space="preserve">• Service Availability &amp; Rate Limits: </w:t>
       </w:r>
       <w:r>
-        <w:t>Aggregates multi-source web reports returning main summary, top 3 related topics with snippets, and direct search URL buttons.</w:t>
+        <w:t>ARIA and external integrations (Wikipedia API, Google Identity Services) are provided 'as-is'. Automated rate limits apply to third-party endpoints to maintain stability.</w:t>
+      </w:r>
+    </w:p>
+    <w:p>
+      <w:pPr>
+        <w:pStyle w:val="Heading2"/>
+      </w:pPr>
+      <w:r>
+        <w:rPr>
+          <w:color w:val="0099CC"/>
+        </w:rPr>
+        <w:t>3.2 Error Rectification &amp; Diagnostics</w:t>
       </w:r>
     </w:p>
     <w:p>
@@ -569,10 +1211,10 @@
           <w:b/>
           <w:color w:val="003366"/>
         </w:rPr>
-        <w:t xml:space="preserve">• Math Expression Solver: </w:t>
+        <w:t xml:space="preserve">• Database Schema Migration Rectification: </w:t>
       </w:r>
       <w:r>
-        <w:t>Evaluates mathematical word problems and expressions safely (addition, subtraction, multiplication, division).</w:t>
+        <w:t>Added automatic schema inspection routines (PRAGMA table_info) and ALTER TABLE migrations to app.py to prevent 'no such column' errors when updating legacy SQLite database files.</w:t>
       </w:r>
     </w:p>
     <w:p>
@@ -581,10 +1223,10 @@
           <w:b/>
           <w:color w:val="003366"/>
         </w:rPr>
-        <w:t xml:space="preserve">• System Performance Gauges: </w:t>
+        <w:t xml:space="preserve">• Duplicate Email &amp; Invalid Password Handling: </w:t>
       </w:r>
       <w:r>
-        <w:t>Monitors host CPU utilization percentage and RAM usage in real-time via psutil.</w:t>
+        <w:t>Implemented strict backend validation (minimum 6 character passwords, duplicate email checks, 401 Unauthorized status responses) preventing corrupt database records.</w:t>
       </w:r>
     </w:p>
     <w:p>
@@ -593,10 +1235,22 @@
           <w:b/>
           <w:color w:val="003366"/>
         </w:rPr>
-        <w:t xml:space="preserve">• Joke &amp; Entertainment Module: </w:t>
+        <w:t xml:space="preserve">• Google OAuth Popup Block / Fallback: </w:t>
       </w:r>
       <w:r>
-        <w:t>Generates humorous programming and general jokes via pyjokes.</w:t>
+        <w:t>Handled Google Identity Services SDK popup blockages by providing an interactive custom prompt fallback dialog so users can log in seamlessly even if third-party popups are restricted.</w:t>
+      </w:r>
+    </w:p>
+    <w:p>
+      <w:r>
+        <w:rPr>
+          <w:b/>
+          <w:color w:val="003366"/>
+        </w:rPr>
+        <w:t xml:space="preserve">• Microphone Permission &amp; Browser Speech Fallback: </w:t>
+      </w:r>
+      <w:r>
+        <w:t>Resolved 'not-allowed' and 'no-speech' Web Speech API browser errors by auto-switching the interface to text input mode with clear status feedback.</w:t>
       </w:r>
     </w:p>
     <w:p>
@@ -612,7 +1266,7 @@
     </w:p>
     <w:p>
       <w:r>
-        <w:t>An automated test suite (test_assistant.py) containing 10 comprehensive unit tests was developed and executed. All 10 unit tests executed successfully with 0 errors.</w:t>
+        <w:t>Automated unit test suites (test_assistant.py and test_auth_db.py) were executed to verify both voice engine capabilities and SQL database authentication. All 14 tests executed with 100% success rate.</w:t>
       </w:r>
     </w:p>
     <w:tbl>
@@ -653,7 +1307,7 @@
                 <w:b/>
                 <w:color w:val="FFFFFF"/>
               </w:rPr>
-              <w:t>Command Tested</w:t>
+              <w:t>Module / Command Tested</w:t>
             </w:r>
           </w:p>
         </w:tc>
@@ -1033,6 +1687,150 @@
           </w:p>
         </w:tc>
       </w:tr>
+      <w:tr>
+        <w:tc>
+          <w:tcPr>
+            <w:tcW w:type="dxa" w:w="3120"/>
+          </w:tcPr>
+          <w:p>
+            <w:r>
+              <w:t>Test 11</w:t>
+            </w:r>
+          </w:p>
+        </w:tc>
+        <w:tc>
+          <w:tcPr>
+            <w:tcW w:type="dxa" w:w="3120"/>
+          </w:tcPr>
+          <w:p>
+            <w:r>
+              <w:t>SQLite Schema Integrity Check</w:t>
+            </w:r>
+          </w:p>
+        </w:tc>
+        <w:tc>
+          <w:tcPr>
+            <w:tcW w:type="dxa" w:w="3120"/>
+          </w:tcPr>
+          <w:p>
+            <w:r>
+              <w:rPr>
+                <w:b/>
+                <w:color w:val="00994C"/>
+              </w:rPr>
+              <w:t>PASSED (100%)</w:t>
+            </w:r>
+          </w:p>
+        </w:tc>
+      </w:tr>
+      <w:tr>
+        <w:tc>
+          <w:tcPr>
+            <w:tcW w:type="dxa" w:w="3120"/>
+          </w:tcPr>
+          <w:p>
+            <w:r>
+              <w:t>Test 12</w:t>
+            </w:r>
+          </w:p>
+        </w:tc>
+        <w:tc>
+          <w:tcPr>
+            <w:tcW w:type="dxa" w:w="3120"/>
+          </w:tcPr>
+          <w:p>
+            <w:r>
+              <w:t>Email &amp; Password Account Registration</w:t>
+            </w:r>
+          </w:p>
+        </w:tc>
+        <w:tc>
+          <w:tcPr>
+            <w:tcW w:type="dxa" w:w="3120"/>
+          </w:tcPr>
+          <w:p>
+            <w:r>
+              <w:rPr>
+                <w:b/>
+                <w:color w:val="00994C"/>
+              </w:rPr>
+              <w:t>PASSED (100%)</w:t>
+            </w:r>
+          </w:p>
+        </w:tc>
+      </w:tr>
+      <w:tr>
+        <w:tc>
+          <w:tcPr>
+            <w:tcW w:type="dxa" w:w="3120"/>
+          </w:tcPr>
+          <w:p>
+            <w:r>
+              <w:t>Test 13</w:t>
+            </w:r>
+          </w:p>
+        </w:tc>
+        <w:tc>
+          <w:tcPr>
+            <w:tcW w:type="dxa" w:w="3120"/>
+          </w:tcPr>
+          <w:p>
+            <w:r>
+              <w:t>Email &amp; Password Login &amp; Hashing Check</w:t>
+            </w:r>
+          </w:p>
+        </w:tc>
+        <w:tc>
+          <w:tcPr>
+            <w:tcW w:type="dxa" w:w="3120"/>
+          </w:tcPr>
+          <w:p>
+            <w:r>
+              <w:rPr>
+                <w:b/>
+                <w:color w:val="00994C"/>
+              </w:rPr>
+              <w:t>PASSED (100%)</w:t>
+            </w:r>
+          </w:p>
+        </w:tc>
+      </w:tr>
+      <w:tr>
+        <w:tc>
+          <w:tcPr>
+            <w:tcW w:type="dxa" w:w="3120"/>
+          </w:tcPr>
+          <w:p>
+            <w:r>
+              <w:t>Test 14</w:t>
+            </w:r>
+          </w:p>
+        </w:tc>
+        <w:tc>
+          <w:tcPr>
+            <w:tcW w:type="dxa" w:w="3120"/>
+          </w:tcPr>
+          <w:p>
+            <w:r>
+              <w:t>Google OAuth Account Linking &amp; Sync</w:t>
+            </w:r>
+          </w:p>
+        </w:tc>
+        <w:tc>
+          <w:tcPr>
+            <w:tcW w:type="dxa" w:w="3120"/>
+          </w:tcPr>
+          <w:p>
+            <w:r>
+              <w:rPr>
+                <w:b/>
+                <w:color w:val="00994C"/>
+              </w:rPr>
+              <w:t>PASSED (100%)</w:t>
+            </w:r>
+          </w:p>
+        </w:tc>
+      </w:tr>
     </w:tbl>
     <w:p>
       <w:pPr>
@@ -1047,7 +1845,7 @@
     </w:p>
     <w:p>
       <w:r>
-        <w:t>The AI-Based Voice Assistant project successfully achieves all problem statement requirements. It provides a robust, interactive, and visually striking assistant capable of speech recognition, text-to-speech synthesis, desktop automation, and live search report extraction. The project demonstrates practical integration of speech processing libraries, REST APIs, and modern web UI engineering.</w:t>
+        <w:t>The AI-Based Voice Assistant (ARIA) project successfully fulfills all core academic and functional requirements. With the addition of Google Sign-In OAuth, Email/Password authentication, and persistent SQLite relational database storage, the project delivers a complete, secure, and production-ready voice assistant platform.</w:t>
       </w:r>
     </w:p>
     <w:sectPr>

</xml_diff>